<commit_message>
chore: update Employment Agreement template (repo sync with R2)
</commit_message>
<xml_diff>
--- a/backend/templates-src/employment-agreement.docx
+++ b/backend/templates-src/employment-agreement.docx
@@ -2539,7 +2539,16 @@
           <w:sz w:val="22"/>
           <w:szCs w:val="22"/>
         </w:rPr>
-        <w:t xml:space="preserve">You further agree that the terms and conditions cannot be amended, modified or supplemented except by subsequent written agreement signed by you and </w:t>
+        <w:t xml:space="preserve">You further </w:t>
+      </w:r>
+      <w:r>
+        <w:rPr>
+          <w:rFonts w:ascii="Book Antiqua" w:hAnsi="Book Antiqua"/>
+          <w:sz w:val="22"/>
+          <w:szCs w:val="22"/>
+        </w:rPr>
+        <w:lastRenderedPageBreak/>
+        <w:t xml:space="preserve">agree that the terms and conditions cannot be amended, modified or supplemented except by subsequent written agreement signed by you and </w:t>
       </w:r>
       <w:r>
         <w:rPr>
@@ -2564,6 +2573,203 @@
           <w:szCs w:val="22"/>
         </w:rPr>
         <w:t>.</w:t>
+      </w:r>
+    </w:p>
+    <w:p>
+      <w:pPr>
+        <w:pStyle w:val="StandardL1"/>
+        <w:keepNext/>
+        <w:jc w:val="both"/>
+        <w:rPr>
+          <w:rFonts w:ascii="Book Antiqua" w:hAnsi="Book Antiqua"/>
+          <w:b/>
+          <w:bCs/>
+          <w:sz w:val="22"/>
+          <w:szCs w:val="22"/>
+        </w:rPr>
+      </w:pPr>
+      <w:r>
+        <w:rPr>
+          <w:rFonts w:ascii="Book Antiqua" w:hAnsi="Book Antiqua"/>
+          <w:b/>
+          <w:bCs/>
+          <w:sz w:val="22"/>
+          <w:szCs w:val="22"/>
+        </w:rPr>
+        <w:t>Language</w:t>
+      </w:r>
+    </w:p>
+    <w:p>
+      <w:pPr>
+        <w:pStyle w:val="OHHpara1"/>
+        <w:keepNext/>
+        <w:rPr>
+          <w:rFonts w:ascii="Book Antiqua" w:hAnsi="Book Antiqua"/>
+          <w:i/>
+          <w:iCs/>
+          <w:sz w:val="22"/>
+          <w:szCs w:val="22"/>
+          <w:lang w:val="fr-CA"/>
+        </w:rPr>
+      </w:pPr>
+      <w:r>
+        <w:rPr>
+          <w:rFonts w:ascii="Book Antiqua" w:hAnsi="Book Antiqua"/>
+          <w:sz w:val="22"/>
+          <w:szCs w:val="22"/>
+        </w:rPr>
+        <w:t>You</w:t>
+      </w:r>
+      <w:r>
+        <w:rPr>
+          <w:rFonts w:ascii="Book Antiqua" w:hAnsi="Book Antiqua"/>
+          <w:sz w:val="22"/>
+          <w:szCs w:val="22"/>
+        </w:rPr>
+        <w:t xml:space="preserve"> acknowledges having first received and reviewed a French-language version of this </w:t>
+      </w:r>
+      <w:r>
+        <w:rPr>
+          <w:rFonts w:ascii="Book Antiqua" w:hAnsi="Book Antiqua"/>
+          <w:sz w:val="22"/>
+          <w:szCs w:val="22"/>
+        </w:rPr>
+        <w:t>Offer</w:t>
+      </w:r>
+      <w:r>
+        <w:rPr>
+          <w:rFonts w:ascii="Book Antiqua" w:hAnsi="Book Antiqua"/>
+          <w:sz w:val="22"/>
+          <w:szCs w:val="22"/>
+        </w:rPr>
+        <w:t xml:space="preserve">. After reviewing the French-language version, </w:t>
+      </w:r>
+      <w:r>
+        <w:rPr>
+          <w:rFonts w:ascii="Book Antiqua" w:hAnsi="Book Antiqua"/>
+          <w:sz w:val="22"/>
+          <w:szCs w:val="22"/>
+        </w:rPr>
+        <w:t xml:space="preserve">you have </w:t>
+      </w:r>
+      <w:r>
+        <w:rPr>
+          <w:rFonts w:ascii="Book Antiqua" w:hAnsi="Book Antiqua"/>
+          <w:sz w:val="22"/>
+          <w:szCs w:val="22"/>
+        </w:rPr>
+        <w:t xml:space="preserve">expressly requested that this </w:t>
+      </w:r>
+      <w:r>
+        <w:rPr>
+          <w:rFonts w:ascii="Book Antiqua" w:hAnsi="Book Antiqua"/>
+          <w:sz w:val="22"/>
+          <w:szCs w:val="22"/>
+        </w:rPr>
+        <w:t>Offer</w:t>
+      </w:r>
+      <w:r>
+        <w:rPr>
+          <w:rFonts w:ascii="Book Antiqua" w:hAnsi="Book Antiqua"/>
+          <w:sz w:val="22"/>
+          <w:szCs w:val="22"/>
+        </w:rPr>
+        <w:t xml:space="preserve"> be entered into in the English language and expressly agree to be bound by this English-language version. </w:t>
+      </w:r>
+      <w:r>
+        <w:rPr>
+          <w:rFonts w:ascii="Book Antiqua" w:hAnsi="Book Antiqua"/>
+          <w:sz w:val="22"/>
+          <w:szCs w:val="22"/>
+        </w:rPr>
+        <w:t xml:space="preserve">You </w:t>
+      </w:r>
+      <w:r>
+        <w:rPr>
+          <w:rFonts w:ascii="Book Antiqua" w:hAnsi="Book Antiqua"/>
+          <w:sz w:val="22"/>
+          <w:szCs w:val="22"/>
+        </w:rPr>
+        <w:t xml:space="preserve">expressly agree that all documents relating to this </w:t>
+      </w:r>
+      <w:r>
+        <w:rPr>
+          <w:rFonts w:ascii="Book Antiqua" w:hAnsi="Book Antiqua"/>
+          <w:sz w:val="22"/>
+          <w:szCs w:val="22"/>
+        </w:rPr>
+        <w:t>Offer</w:t>
+      </w:r>
+      <w:r>
+        <w:rPr>
+          <w:rFonts w:ascii="Book Antiqua" w:hAnsi="Book Antiqua"/>
+          <w:sz w:val="22"/>
+          <w:szCs w:val="22"/>
+        </w:rPr>
+        <w:t xml:space="preserve"> may be drawn up in the English language.</w:t>
+      </w:r>
+      <w:r>
+        <w:rPr>
+          <w:rFonts w:ascii="Book Antiqua" w:hAnsi="Book Antiqua"/>
+          <w:sz w:val="22"/>
+          <w:szCs w:val="22"/>
+        </w:rPr>
+        <w:t xml:space="preserve"> </w:t>
+      </w:r>
+      <w:r>
+        <w:rPr>
+          <w:rFonts w:ascii="Book Antiqua" w:hAnsi="Book Antiqua"/>
+          <w:i/>
+          <w:iCs/>
+          <w:sz w:val="22"/>
+          <w:szCs w:val="22"/>
+          <w:lang w:val="fr-CA"/>
+        </w:rPr>
+        <w:t xml:space="preserve">Vous reconnaissez avoir d’abord reçu et examiné une version française de la présente </w:t>
+      </w:r>
+      <w:r>
+        <w:rPr>
+          <w:rFonts w:ascii="Book Antiqua" w:hAnsi="Book Antiqua"/>
+          <w:i/>
+          <w:iCs/>
+          <w:sz w:val="22"/>
+          <w:szCs w:val="22"/>
+          <w:lang w:val="fr-CA"/>
+        </w:rPr>
+        <w:t>offre</w:t>
+      </w:r>
+      <w:r>
+        <w:rPr>
+          <w:rFonts w:ascii="Book Antiqua" w:hAnsi="Book Antiqua"/>
+          <w:i/>
+          <w:iCs/>
+          <w:sz w:val="22"/>
+          <w:szCs w:val="22"/>
+          <w:lang w:val="fr-CA"/>
+        </w:rPr>
+        <w:t xml:space="preserve">. Après avoir examiné la version française, vous avez expressément demandé que la présente offre soit conclue en langue anglaise et vous consentez expressément à être lié par cette version anglaise. Vous convenez expressément que tous les documents relatifs à la présente </w:t>
+      </w:r>
+      <w:r>
+        <w:rPr>
+          <w:rFonts w:ascii="Book Antiqua" w:hAnsi="Book Antiqua"/>
+          <w:i/>
+          <w:iCs/>
+          <w:sz w:val="22"/>
+          <w:szCs w:val="22"/>
+          <w:lang w:val="fr-CA"/>
+        </w:rPr>
+        <w:t>offre</w:t>
+      </w:r>
+      <w:r>
+        <w:rPr>
+          <w:rFonts w:ascii="Book Antiqua" w:hAnsi="Book Antiqua"/>
+          <w:i/>
+          <w:iCs/>
+          <w:sz w:val="22"/>
+          <w:szCs w:val="22"/>
+          <w:lang w:val="fr-CA"/>
+        </w:rPr>
+        <w:t xml:space="preserve"> peuvent être rédigés en langue anglaise.</w:t>
       </w:r>
     </w:p>
     <w:p>
@@ -3502,6 +3708,9 @@
     <w:abstractNumId w:val="1"/>
   </w:num>
   <w:num w:numId="5" w16cid:durableId="1721127896">
+    <w:abstractNumId w:val="1"/>
+  </w:num>
+  <w:num w:numId="6" w16cid:durableId="751395454">
     <w:abstractNumId w:val="1"/>
   </w:num>
 </w:numbering>
@@ -4706,6 +4915,30 @@
 </file>
 
 <file path=customXml/item1.xml><?xml version="1.0" encoding="utf-8"?>
+<b:Sources xmlns:b="http://schemas.openxmlformats.org/officeDocument/2006/bibliography" xmlns="http://schemas.openxmlformats.org/officeDocument/2006/bibliography" SelectedStyle="\APASixthEditionOfficeOnline.xsl" StyleName="APA" Version="6"/>
+</file>
+
+<file path=customXml/item2.xml><?xml version="1.0" encoding="utf-8"?>
+<?mso-contentType ?>
+<FormTemplates xmlns="http://schemas.microsoft.com/sharepoint/v3/contenttype/forms">
+  <Display>DocumentLibraryForm</Display>
+  <Edit>DocumentLibraryForm</Edit>
+  <New>DocumentLibraryForm</New>
+</FormTemplates>
+</file>
+
+<file path=customXml/item3.xml><?xml version="1.0" encoding="utf-8"?>
+<p:properties xmlns:p="http://schemas.microsoft.com/office/2006/metadata/properties" xmlns:xsi="http://www.w3.org/2001/XMLSchema-instance" xmlns:pc="http://schemas.microsoft.com/office/infopath/2007/PartnerControls">
+  <documentManagement>
+    <lcf76f155ced4ddcb4097134ff3c332f xmlns="d902a471-6d23-409f-beeb-c1cf95669feb">
+      <Terms xmlns="http://schemas.microsoft.com/office/infopath/2007/PartnerControls"/>
+    </lcf76f155ced4ddcb4097134ff3c332f>
+    <TaxCatchAll xmlns="d3095238-afb0-46db-b5e2-5361e02e2315" xsi:nil="true"/>
+  </documentManagement>
+</p:properties>
+</file>
+
+<file path=customXml/item4.xml><?xml version="1.0" encoding="utf-8"?>
 <ct:contentTypeSchema xmlns:ct="http://schemas.microsoft.com/office/2006/metadata/contentType" xmlns:ma="http://schemas.microsoft.com/office/2006/metadata/properties/metaAttributes" ct:_="" ma:_="" ma:contentTypeName="Document" ma:contentTypeID="0x010100E4CBB201245DCD488DE442BBA67EA1F2" ma:contentTypeVersion="18" ma:contentTypeDescription="Create a new document." ma:contentTypeScope="" ma:versionID="0e67aec752306b4b000fa6862159d8cb">
   <xsd:schema xmlns:xsd="http://www.w3.org/2001/XMLSchema" xmlns:xs="http://www.w3.org/2001/XMLSchema" xmlns:p="http://schemas.microsoft.com/office/2006/metadata/properties" xmlns:ns2="d902a471-6d23-409f-beeb-c1cf95669feb" xmlns:ns3="d3095238-afb0-46db-b5e2-5361e02e2315" targetNamespace="http://schemas.microsoft.com/office/2006/metadata/properties" ma:root="true" ma:fieldsID="20ee3e46f629b63a38b00c7d8dccbc3d" ns2:_="" ns3:_="">
     <xsd:import namespace="d902a471-6d23-409f-beeb-c1cf95669feb"/>
@@ -4960,31 +5193,34 @@
 </ct:contentTypeSchema>
 </file>
 
-<file path=customXml/item2.xml><?xml version="1.0" encoding="utf-8"?>
-<p:properties xmlns:p="http://schemas.microsoft.com/office/2006/metadata/properties" xmlns:xsi="http://www.w3.org/2001/XMLSchema-instance" xmlns:pc="http://schemas.microsoft.com/office/infopath/2007/PartnerControls">
-  <documentManagement>
-    <lcf76f155ced4ddcb4097134ff3c332f xmlns="d902a471-6d23-409f-beeb-c1cf95669feb">
-      <Terms xmlns="http://schemas.microsoft.com/office/infopath/2007/PartnerControls"/>
-    </lcf76f155ced4ddcb4097134ff3c332f>
-    <TaxCatchAll xmlns="d3095238-afb0-46db-b5e2-5361e02e2315" xsi:nil="true"/>
-  </documentManagement>
-</p:properties>
+<file path=customXml/itemProps1.xml><?xml version="1.0" encoding="utf-8"?>
+<ds:datastoreItem xmlns:ds="http://schemas.openxmlformats.org/officeDocument/2006/customXml" ds:itemID="{470987EE-C585-4F93-97FB-CC0BED43802B}">
+  <ds:schemaRefs>
+    <ds:schemaRef ds:uri="http://schemas.openxmlformats.org/officeDocument/2006/bibliography"/>
+  </ds:schemaRefs>
+</ds:datastoreItem>
 </file>
 
-<file path=customXml/item3.xml><?xml version="1.0" encoding="utf-8"?>
-<?mso-contentType ?>
-<FormTemplates xmlns="http://schemas.microsoft.com/sharepoint/v3/contenttype/forms">
-  <Display>DocumentLibraryForm</Display>
-  <Edit>DocumentLibraryForm</Edit>
-  <New>DocumentLibraryForm</New>
-</FormTemplates>
+<file path=customXml/itemProps2.xml><?xml version="1.0" encoding="utf-8"?>
+<ds:datastoreItem xmlns:ds="http://schemas.openxmlformats.org/officeDocument/2006/customXml" ds:itemID="{3B25287A-E0C4-425A-94B9-ACF9F7E4F1CB}">
+  <ds:schemaRefs>
+    <ds:schemaRef ds:uri="http://schemas.microsoft.com/sharepoint/v3/contenttype/forms"/>
+  </ds:schemaRefs>
+</ds:datastoreItem>
 </file>
 
-<file path=customXml/item4.xml><?xml version="1.0" encoding="utf-8"?>
-<b:Sources xmlns:b="http://schemas.openxmlformats.org/officeDocument/2006/bibliography" xmlns="http://schemas.openxmlformats.org/officeDocument/2006/bibliography" SelectedStyle="\APASixthEditionOfficeOnline.xsl" StyleName="APA" Version="6"/>
+<file path=customXml/itemProps3.xml><?xml version="1.0" encoding="utf-8"?>
+<ds:datastoreItem xmlns:ds="http://schemas.openxmlformats.org/officeDocument/2006/customXml" ds:itemID="{A970F238-3A72-4534-AB98-808FA5724E0E}">
+  <ds:schemaRefs>
+    <ds:schemaRef ds:uri="http://schemas.microsoft.com/office/2006/metadata/properties"/>
+    <ds:schemaRef ds:uri="http://schemas.microsoft.com/office/infopath/2007/PartnerControls"/>
+    <ds:schemaRef ds:uri="d902a471-6d23-409f-beeb-c1cf95669feb"/>
+    <ds:schemaRef ds:uri="d3095238-afb0-46db-b5e2-5361e02e2315"/>
+  </ds:schemaRefs>
+</ds:datastoreItem>
 </file>
 
-<file path=customXml/itemProps1.xml><?xml version="1.0" encoding="utf-8"?>
+<file path=customXml/itemProps4.xml><?xml version="1.0" encoding="utf-8"?>
 <ds:datastoreItem xmlns:ds="http://schemas.openxmlformats.org/officeDocument/2006/customXml" ds:itemID="{AB289AE6-61FE-419D-A553-CFF1C6FAF650}">
   <ds:schemaRefs>
     <ds:schemaRef ds:uri="http://schemas.microsoft.com/office/2006/metadata/contentType"/>
@@ -5001,31 +5237,4 @@
     <ds:schemaRef ds:uri="http://schemas.microsoft.com/internal/obd"/>
   </ds:schemaRefs>
 </ds:datastoreItem>
-</file>
-
-<file path=customXml/itemProps2.xml><?xml version="1.0" encoding="utf-8"?>
-<ds:datastoreItem xmlns:ds="http://schemas.openxmlformats.org/officeDocument/2006/customXml" ds:itemID="{A970F238-3A72-4534-AB98-808FA5724E0E}">
-  <ds:schemaRefs>
-    <ds:schemaRef ds:uri="http://schemas.microsoft.com/office/2006/metadata/properties"/>
-    <ds:schemaRef ds:uri="http://schemas.microsoft.com/office/infopath/2007/PartnerControls"/>
-    <ds:schemaRef ds:uri="d902a471-6d23-409f-beeb-c1cf95669feb"/>
-    <ds:schemaRef ds:uri="d3095238-afb0-46db-b5e2-5361e02e2315"/>
-  </ds:schemaRefs>
-</ds:datastoreItem>
-</file>
-
-<file path=customXml/itemProps3.xml><?xml version="1.0" encoding="utf-8"?>
-<ds:datastoreItem xmlns:ds="http://schemas.openxmlformats.org/officeDocument/2006/customXml" ds:itemID="{3B25287A-E0C4-425A-94B9-ACF9F7E4F1CB}">
-  <ds:schemaRefs>
-    <ds:schemaRef ds:uri="http://schemas.microsoft.com/sharepoint/v3/contenttype/forms"/>
-  </ds:schemaRefs>
-</ds:datastoreItem>
-</file>
-
-<file path=customXml/itemProps4.xml><?xml version="1.0" encoding="utf-8"?>
-<ds:datastoreItem xmlns:ds="http://schemas.openxmlformats.org/officeDocument/2006/customXml" ds:itemID="{470987EE-C585-4F93-97FB-CC0BED43802B}">
-  <ds:schemaRefs>
-    <ds:schemaRef ds:uri="http://schemas.openxmlformats.org/officeDocument/2006/bibliography"/>
-  </ds:schemaRefs>
-</ds:datastoreItem>
 </file>
</xml_diff>

<commit_message>
feat(templates): add Contractor, Mutual NDA, FR Employment; update EN Employment
- Replace EN Employment Agreement bytes with new version
- Add independent-contractor-agreement (Commercial)
- Add mutual-nda (Confidentiality)
- Add employment-agreement-fr (Employment, French)
- Seeded all 4 to R2
</commit_message>
<xml_diff>
--- a/backend/templates-src/employment-agreement.docx
+++ b/backend/templates-src/employment-agreement.docx
@@ -2626,7 +2626,25 @@
           <w:sz w:val="22"/>
           <w:szCs w:val="22"/>
         </w:rPr>
-        <w:t xml:space="preserve"> acknowledges having first received and reviewed a French-language version of this </w:t>
+        <w:t xml:space="preserve"> </w:t>
+      </w:r>
+      <w:proofErr w:type="gramStart"/>
+      <w:r>
+        <w:rPr>
+          <w:rFonts w:ascii="Book Antiqua" w:hAnsi="Book Antiqua"/>
+          <w:sz w:val="22"/>
+          <w:szCs w:val="22"/>
+        </w:rPr>
+        <w:t>acknowledges</w:t>
+      </w:r>
+      <w:proofErr w:type="gramEnd"/>
+      <w:r>
+        <w:rPr>
+          <w:rFonts w:ascii="Book Antiqua" w:hAnsi="Book Antiqua"/>
+          <w:sz w:val="22"/>
+          <w:szCs w:val="22"/>
+        </w:rPr>
+        <w:t xml:space="preserve"> having first received and reviewed a French-language version of this </w:t>
       </w:r>
       <w:r>
         <w:rPr>
@@ -2804,7 +2822,6 @@
           <w:szCs w:val="22"/>
         </w:rPr>
         <w:sectPr>
-          <w:footerReference w:type="default" r:id="rId11"/>
           <w:pgSz w:w="12240" w:h="15840" w:code="1"/>
           <w:pgMar w:top="1440" w:right="1440" w:bottom="1008" w:left="1440" w:header="706" w:footer="706" w:gutter="0"/>
           <w:cols w:space="720"/>
@@ -3014,7 +3031,25 @@
           <w:sz w:val="22"/>
           <w:szCs w:val="22"/>
         </w:rPr>
-        <w:t xml:space="preserve">I have read and understood this letter and I accept </w:t>
+        <w:t xml:space="preserve">I have read and understood this </w:t>
+      </w:r>
+      <w:proofErr w:type="gramStart"/>
+      <w:r>
+        <w:rPr>
+          <w:rFonts w:ascii="Book Antiqua" w:hAnsi="Book Antiqua"/>
+          <w:sz w:val="22"/>
+          <w:szCs w:val="22"/>
+        </w:rPr>
+        <w:t>letter</w:t>
+      </w:r>
+      <w:proofErr w:type="gramEnd"/>
+      <w:r>
+        <w:rPr>
+          <w:rFonts w:ascii="Book Antiqua" w:hAnsi="Book Antiqua"/>
+          <w:sz w:val="22"/>
+          <w:szCs w:val="22"/>
+        </w:rPr>
+        <w:t xml:space="preserve"> and I accept </w:t>
       </w:r>
       <w:r>
         <w:rPr>
@@ -3118,7 +3153,7 @@
       </w:pPr>
     </w:p>
     <w:sectPr>
-      <w:footerReference w:type="default" r:id="rId12"/>
+      <w:footerReference w:type="default" r:id="rId7"/>
       <w:pgSz w:w="12240" w:h="15840" w:code="1"/>
       <w:pgMar w:top="1440" w:right="1440" w:bottom="1008" w:left="1440" w:header="706" w:footer="706" w:gutter="0"/>
       <w:cols w:space="720"/>
@@ -3148,83 +3183,6 @@
 </file>
 
 <file path=word/footer1.xml><?xml version="1.0" encoding="utf-8"?>
-<w:ftr xmlns:wpc="http://schemas.microsoft.com/office/word/2010/wordprocessingCanvas" xmlns:cx="http://schemas.microsoft.com/office/drawing/2014/chartex" xmlns:cx1="http://schemas.microsoft.com/office/drawing/2015/9/8/chartex" xmlns:cx2="http://schemas.microsoft.com/office/drawing/2015/10/21/chartex" xmlns:cx3="http://schemas.microsoft.com/office/drawing/2016/5/9/chartex" xmlns:cx4="http://schemas.microsoft.com/office/drawing/2016/5/10/chartex" xmlns:cx5="http://schemas.microsoft.com/office/drawing/2016/5/11/chartex" xmlns:cx6="http://schemas.microsoft.com/office/drawing/2016/5/12/chartex" xmlns:cx7="http://schemas.microsoft.com/office/drawing/2016/5/13/chartex" xmlns:cx8="http://schemas.microsoft.com/office/drawing/2016/5/14/chartex" xmlns:mc="http://schemas.openxmlformats.org/markup-compatibility/2006" xmlns:aink="http://schemas.microsoft.com/office/drawing/2016/ink" xmlns:am3d="http://schemas.microsoft.com/office/drawing/2017/model3d" xmlns:o="urn:schemas-microsoft-com:office:office" xmlns:oel="http://schemas.microsoft.com/office/2019/extlst" xmlns:r="http://schemas.openxmlformats.org/officeDocument/2006/relationships" xmlns:m="http://schemas.openxmlformats.org/officeDocument/2006/math" xmlns:v="urn:schemas-microsoft-com:vml" xmlns:wp14="http://schemas.microsoft.com/office/word/2010/wordprocessingDrawing" xmlns:wp="http://schemas.openxmlformats.org/drawingml/2006/wordprocessingDrawing" xmlns:w10="urn:schemas-microsoft-com:office:word" xmlns:w="http://schemas.openxmlformats.org/wordprocessingml/2006/main" xmlns:w14="http://schemas.microsoft.com/office/word/2010/wordml" xmlns:w15="http://schemas.microsoft.com/office/word/2012/wordml" xmlns:w16cex="http://schemas.microsoft.com/office/word/2018/wordml/cex" xmlns:w16cid="http://schemas.microsoft.com/office/word/2016/wordml/cid" xmlns:w16="http://schemas.microsoft.com/office/word/2018/wordml" xmlns:w16du="http://schemas.microsoft.com/office/word/2023/wordml/word16du" xmlns:w16sdtdh="http://schemas.microsoft.com/office/word/2020/wordml/sdtdatahash" xmlns:w16sdtfl="http://schemas.microsoft.com/office/word/2024/wordml/sdtformatlock" xmlns:w16se="http://schemas.microsoft.com/office/word/2015/wordml/symex" xmlns:wpg="http://schemas.microsoft.com/office/word/2010/wordprocessingGroup" xmlns:wpi="http://schemas.microsoft.com/office/word/2010/wordprocessingInk" xmlns:wne="http://schemas.microsoft.com/office/word/2006/wordml" xmlns:wps="http://schemas.microsoft.com/office/word/2010/wordprocessingShape" mc:Ignorable="w14 w15 w16se w16cid w16 w16cex w16sdtdh w16sdtfl w16du wp14">
-  <w:sdt>
-    <w:sdtPr>
-      <w:id w:val="1913186914"/>
-      <w:docPartObj>
-        <w:docPartGallery w:val="Page Numbers (Bottom of Page)"/>
-        <w:docPartUnique/>
-      </w:docPartObj>
-    </w:sdtPr>
-    <w:sdtEndPr>
-      <w:rPr>
-        <w:rFonts w:ascii="Book Antiqua" w:hAnsi="Book Antiqua"/>
-        <w:noProof/>
-        <w:sz w:val="22"/>
-        <w:szCs w:val="22"/>
-      </w:rPr>
-    </w:sdtEndPr>
-    <w:sdtContent>
-      <w:p>
-        <w:pPr>
-          <w:pStyle w:val="Footer"/>
-          <w:jc w:val="center"/>
-          <w:rPr>
-            <w:rFonts w:ascii="Book Antiqua" w:hAnsi="Book Antiqua"/>
-            <w:sz w:val="22"/>
-            <w:szCs w:val="22"/>
-          </w:rPr>
-        </w:pPr>
-        <w:r>
-          <w:rPr>
-            <w:rFonts w:ascii="Book Antiqua" w:hAnsi="Book Antiqua"/>
-            <w:sz w:val="22"/>
-            <w:szCs w:val="22"/>
-          </w:rPr>
-          <w:fldChar w:fldCharType="begin"/>
-        </w:r>
-        <w:r>
-          <w:rPr>
-            <w:rFonts w:ascii="Book Antiqua" w:hAnsi="Book Antiqua"/>
-            <w:sz w:val="22"/>
-            <w:szCs w:val="22"/>
-          </w:rPr>
-          <w:instrText xml:space="preserve"> PAGE   \* MERGEFORMAT </w:instrText>
-        </w:r>
-        <w:r>
-          <w:rPr>
-            <w:rFonts w:ascii="Book Antiqua" w:hAnsi="Book Antiqua"/>
-            <w:sz w:val="22"/>
-            <w:szCs w:val="22"/>
-          </w:rPr>
-          <w:fldChar w:fldCharType="separate"/>
-        </w:r>
-        <w:r>
-          <w:rPr>
-            <w:rFonts w:ascii="Book Antiqua" w:hAnsi="Book Antiqua"/>
-            <w:noProof/>
-            <w:sz w:val="22"/>
-            <w:szCs w:val="22"/>
-          </w:rPr>
-          <w:t>2</w:t>
-        </w:r>
-        <w:r>
-          <w:rPr>
-            <w:rFonts w:ascii="Book Antiqua" w:hAnsi="Book Antiqua"/>
-            <w:noProof/>
-            <w:sz w:val="22"/>
-            <w:szCs w:val="22"/>
-          </w:rPr>
-          <w:fldChar w:fldCharType="end"/>
-        </w:r>
-      </w:p>
-    </w:sdtContent>
-  </w:sdt>
-</w:ftr>
-</file>
-
-<file path=word/footer2.xml><?xml version="1.0" encoding="utf-8"?>
 <w:ftr xmlns:wpc="http://schemas.microsoft.com/office/word/2010/wordprocessingCanvas" xmlns:cx="http://schemas.microsoft.com/office/drawing/2014/chartex" xmlns:cx1="http://schemas.microsoft.com/office/drawing/2015/9/8/chartex" xmlns:cx2="http://schemas.microsoft.com/office/drawing/2015/10/21/chartex" xmlns:cx3="http://schemas.microsoft.com/office/drawing/2016/5/9/chartex" xmlns:cx4="http://schemas.microsoft.com/office/drawing/2016/5/10/chartex" xmlns:cx5="http://schemas.microsoft.com/office/drawing/2016/5/11/chartex" xmlns:cx6="http://schemas.microsoft.com/office/drawing/2016/5/12/chartex" xmlns:cx7="http://schemas.microsoft.com/office/drawing/2016/5/13/chartex" xmlns:cx8="http://schemas.microsoft.com/office/drawing/2016/5/14/chartex" xmlns:mc="http://schemas.openxmlformats.org/markup-compatibility/2006" xmlns:aink="http://schemas.microsoft.com/office/drawing/2016/ink" xmlns:am3d="http://schemas.microsoft.com/office/drawing/2017/model3d" xmlns:o="urn:schemas-microsoft-com:office:office" xmlns:oel="http://schemas.microsoft.com/office/2019/extlst" xmlns:r="http://schemas.openxmlformats.org/officeDocument/2006/relationships" xmlns:m="http://schemas.openxmlformats.org/officeDocument/2006/math" xmlns:v="urn:schemas-microsoft-com:vml" xmlns:wp14="http://schemas.microsoft.com/office/word/2010/wordprocessingDrawing" xmlns:wp="http://schemas.openxmlformats.org/drawingml/2006/wordprocessingDrawing" xmlns:w10="urn:schemas-microsoft-com:office:word" xmlns:w="http://schemas.openxmlformats.org/wordprocessingml/2006/main" xmlns:w14="http://schemas.microsoft.com/office/word/2010/wordml" xmlns:w15="http://schemas.microsoft.com/office/word/2012/wordml" xmlns:w16cex="http://schemas.microsoft.com/office/word/2018/wordml/cex" xmlns:w16cid="http://schemas.microsoft.com/office/word/2016/wordml/cid" xmlns:w16="http://schemas.microsoft.com/office/word/2018/wordml" xmlns:w16du="http://schemas.microsoft.com/office/word/2023/wordml/word16du" xmlns:w16sdtdh="http://schemas.microsoft.com/office/word/2020/wordml/sdtdatahash" xmlns:w16sdtfl="http://schemas.microsoft.com/office/word/2024/wordml/sdtformatlock" xmlns:w16se="http://schemas.microsoft.com/office/word/2015/wordml/symex" xmlns:wpg="http://schemas.microsoft.com/office/word/2010/wordprocessingGroup" xmlns:wpi="http://schemas.microsoft.com/office/word/2010/wordprocessingInk" xmlns:wne="http://schemas.microsoft.com/office/word/2006/wordml" xmlns:wps="http://schemas.microsoft.com/office/word/2010/wordprocessingShape" mc:Ignorable="w14 w15 w16se w16cid w16 w16cex w16sdtdh w16sdtfl w16du wp14">
   <w:p>
     <w:pPr>
@@ -4135,6 +4093,7 @@
   <w:style w:type="character" w:default="1" w:styleId="DefaultParagraphFont">
     <w:name w:val="Default Paragraph Font"/>
     <w:uiPriority w:val="1"/>
+    <w:semiHidden/>
     <w:unhideWhenUsed/>
   </w:style>
   <w:style w:type="table" w:default="1" w:styleId="TableNormal">
@@ -4912,329 +4871,4 @@
     </a:ext>
   </a:extLst>
 </a:theme>
-</file>
-
-<file path=customXml/item1.xml><?xml version="1.0" encoding="utf-8"?>
-<b:Sources xmlns:b="http://schemas.openxmlformats.org/officeDocument/2006/bibliography" xmlns="http://schemas.openxmlformats.org/officeDocument/2006/bibliography" SelectedStyle="\APASixthEditionOfficeOnline.xsl" StyleName="APA" Version="6"/>
-</file>
-
-<file path=customXml/item2.xml><?xml version="1.0" encoding="utf-8"?>
-<?mso-contentType ?>
-<FormTemplates xmlns="http://schemas.microsoft.com/sharepoint/v3/contenttype/forms">
-  <Display>DocumentLibraryForm</Display>
-  <Edit>DocumentLibraryForm</Edit>
-  <New>DocumentLibraryForm</New>
-</FormTemplates>
-</file>
-
-<file path=customXml/item3.xml><?xml version="1.0" encoding="utf-8"?>
-<p:properties xmlns:p="http://schemas.microsoft.com/office/2006/metadata/properties" xmlns:xsi="http://www.w3.org/2001/XMLSchema-instance" xmlns:pc="http://schemas.microsoft.com/office/infopath/2007/PartnerControls">
-  <documentManagement>
-    <lcf76f155ced4ddcb4097134ff3c332f xmlns="d902a471-6d23-409f-beeb-c1cf95669feb">
-      <Terms xmlns="http://schemas.microsoft.com/office/infopath/2007/PartnerControls"/>
-    </lcf76f155ced4ddcb4097134ff3c332f>
-    <TaxCatchAll xmlns="d3095238-afb0-46db-b5e2-5361e02e2315" xsi:nil="true"/>
-  </documentManagement>
-</p:properties>
-</file>
-
-<file path=customXml/item4.xml><?xml version="1.0" encoding="utf-8"?>
-<ct:contentTypeSchema xmlns:ct="http://schemas.microsoft.com/office/2006/metadata/contentType" xmlns:ma="http://schemas.microsoft.com/office/2006/metadata/properties/metaAttributes" ct:_="" ma:_="" ma:contentTypeName="Document" ma:contentTypeID="0x010100E4CBB201245DCD488DE442BBA67EA1F2" ma:contentTypeVersion="18" ma:contentTypeDescription="Create a new document." ma:contentTypeScope="" ma:versionID="0e67aec752306b4b000fa6862159d8cb">
-  <xsd:schema xmlns:xsd="http://www.w3.org/2001/XMLSchema" xmlns:xs="http://www.w3.org/2001/XMLSchema" xmlns:p="http://schemas.microsoft.com/office/2006/metadata/properties" xmlns:ns2="d902a471-6d23-409f-beeb-c1cf95669feb" xmlns:ns3="d3095238-afb0-46db-b5e2-5361e02e2315" targetNamespace="http://schemas.microsoft.com/office/2006/metadata/properties" ma:root="true" ma:fieldsID="20ee3e46f629b63a38b00c7d8dccbc3d" ns2:_="" ns3:_="">
-    <xsd:import namespace="d902a471-6d23-409f-beeb-c1cf95669feb"/>
-    <xsd:import namespace="d3095238-afb0-46db-b5e2-5361e02e2315"/>
-    <xsd:element name="properties">
-      <xsd:complexType>
-        <xsd:sequence>
-          <xsd:element name="documentManagement">
-            <xsd:complexType>
-              <xsd:all>
-                <xsd:element ref="ns2:MediaServiceMetadata" minOccurs="0"/>
-                <xsd:element ref="ns2:MediaServiceFastMetadata" minOccurs="0"/>
-                <xsd:element ref="ns2:MediaServiceDateTaken" minOccurs="0"/>
-                <xsd:element ref="ns2:MediaServiceAutoTags" minOccurs="0"/>
-                <xsd:element ref="ns2:MediaServiceLocation" minOccurs="0"/>
-                <xsd:element ref="ns2:MediaServiceOCR" minOccurs="0"/>
-                <xsd:element ref="ns2:MediaServiceGenerationTime" minOccurs="0"/>
-                <xsd:element ref="ns2:MediaServiceEventHashCode" minOccurs="0"/>
-                <xsd:element ref="ns2:MediaServiceAutoKeyPoints" minOccurs="0"/>
-                <xsd:element ref="ns2:MediaServiceKeyPoints" minOccurs="0"/>
-                <xsd:element ref="ns3:SharedWithUsers" minOccurs="0"/>
-                <xsd:element ref="ns3:SharedWithDetails" minOccurs="0"/>
-                <xsd:element ref="ns2:lcf76f155ced4ddcb4097134ff3c332f" minOccurs="0"/>
-                <xsd:element ref="ns3:TaxCatchAll" minOccurs="0"/>
-                <xsd:element ref="ns2:MediaLengthInSeconds" minOccurs="0"/>
-                <xsd:element ref="ns2:MediaServiceObjectDetectorVersions" minOccurs="0"/>
-                <xsd:element ref="ns2:MediaServiceSearchProperties" minOccurs="0"/>
-              </xsd:all>
-            </xsd:complexType>
-          </xsd:element>
-        </xsd:sequence>
-      </xsd:complexType>
-    </xsd:element>
-  </xsd:schema>
-  <xsd:schema xmlns:xsd="http://www.w3.org/2001/XMLSchema" xmlns:xs="http://www.w3.org/2001/XMLSchema" xmlns:dms="http://schemas.microsoft.com/office/2006/documentManagement/types" xmlns:pc="http://schemas.microsoft.com/office/infopath/2007/PartnerControls" targetNamespace="d902a471-6d23-409f-beeb-c1cf95669feb" elementFormDefault="qualified">
-    <xsd:import namespace="http://schemas.microsoft.com/office/2006/documentManagement/types"/>
-    <xsd:import namespace="http://schemas.microsoft.com/office/infopath/2007/PartnerControls"/>
-    <xsd:element name="MediaServiceMetadata" ma:index="8" nillable="true" ma:displayName="MediaServiceMetadata" ma:hidden="true" ma:internalName="MediaServiceMetadata" ma:readOnly="true">
-      <xsd:simpleType>
-        <xsd:restriction base="dms:Note"/>
-      </xsd:simpleType>
-    </xsd:element>
-    <xsd:element name="MediaServiceFastMetadata" ma:index="9" nillable="true" ma:displayName="MediaServiceFastMetadata" ma:hidden="true" ma:internalName="MediaServiceFastMetadata" ma:readOnly="true">
-      <xsd:simpleType>
-        <xsd:restriction base="dms:Note"/>
-      </xsd:simpleType>
-    </xsd:element>
-    <xsd:element name="MediaServiceDateTaken" ma:index="10" nillable="true" ma:displayName="MediaServiceDateTaken" ma:hidden="true" ma:internalName="MediaServiceDateTaken" ma:readOnly="true">
-      <xsd:simpleType>
-        <xsd:restriction base="dms:Text"/>
-      </xsd:simpleType>
-    </xsd:element>
-    <xsd:element name="MediaServiceAutoTags" ma:index="11" nillable="true" ma:displayName="Tags" ma:internalName="MediaServiceAutoTags" ma:readOnly="true">
-      <xsd:simpleType>
-        <xsd:restriction base="dms:Text"/>
-      </xsd:simpleType>
-    </xsd:element>
-    <xsd:element name="MediaServiceLocation" ma:index="12" nillable="true" ma:displayName="Location" ma:internalName="MediaServiceLocation" ma:readOnly="true">
-      <xsd:simpleType>
-        <xsd:restriction base="dms:Text"/>
-      </xsd:simpleType>
-    </xsd:element>
-    <xsd:element name="MediaServiceOCR" ma:index="13" nillable="true" ma:displayName="Extracted Text" ma:internalName="MediaServiceOCR" ma:readOnly="true">
-      <xsd:simpleType>
-        <xsd:restriction base="dms:Note">
-          <xsd:maxLength value="255"/>
-        </xsd:restriction>
-      </xsd:simpleType>
-    </xsd:element>
-    <xsd:element name="MediaServiceGenerationTime" ma:index="14" nillable="true" ma:displayName="MediaServiceGenerationTime" ma:hidden="true" ma:internalName="MediaServiceGenerationTime" ma:readOnly="true">
-      <xsd:simpleType>
-        <xsd:restriction base="dms:Text"/>
-      </xsd:simpleType>
-    </xsd:element>
-    <xsd:element name="MediaServiceEventHashCode" ma:index="15" nillable="true" ma:displayName="MediaServiceEventHashCode" ma:hidden="true" ma:internalName="MediaServiceEventHashCode" ma:readOnly="true">
-      <xsd:simpleType>
-        <xsd:restriction base="dms:Text"/>
-      </xsd:simpleType>
-    </xsd:element>
-    <xsd:element name="MediaServiceAutoKeyPoints" ma:index="16" nillable="true" ma:displayName="MediaServiceAutoKeyPoints" ma:hidden="true" ma:internalName="MediaServiceAutoKeyPoints" ma:readOnly="true">
-      <xsd:simpleType>
-        <xsd:restriction base="dms:Note"/>
-      </xsd:simpleType>
-    </xsd:element>
-    <xsd:element name="MediaServiceKeyPoints" ma:index="17" nillable="true" ma:displayName="KeyPoints" ma:internalName="MediaServiceKeyPoints" ma:readOnly="true">
-      <xsd:simpleType>
-        <xsd:restriction base="dms:Note">
-          <xsd:maxLength value="255"/>
-        </xsd:restriction>
-      </xsd:simpleType>
-    </xsd:element>
-    <xsd:element name="lcf76f155ced4ddcb4097134ff3c332f" ma:index="21" nillable="true" ma:taxonomy="true" ma:internalName="lcf76f155ced4ddcb4097134ff3c332f" ma:taxonomyFieldName="MediaServiceImageTags" ma:displayName="Image Tags" ma:readOnly="false" ma:fieldId="{5cf76f15-5ced-4ddc-b409-7134ff3c332f}" ma:taxonomyMulti="true" ma:sspId="cb5123c0-8826-42c4-aea8-c987c0677d67" ma:termSetId="09814cd3-568e-fe90-9814-8d621ff8fb84" ma:anchorId="fba54fb3-c3e1-fe81-a776-ca4b69148c4d" ma:open="true" ma:isKeyword="false">
-      <xsd:complexType>
-        <xsd:sequence>
-          <xsd:element ref="pc:Terms" minOccurs="0" maxOccurs="1"/>
-        </xsd:sequence>
-      </xsd:complexType>
-    </xsd:element>
-    <xsd:element name="MediaLengthInSeconds" ma:index="23" nillable="true" ma:displayName="MediaLengthInSeconds" ma:hidden="true" ma:internalName="MediaLengthInSeconds" ma:readOnly="true">
-      <xsd:simpleType>
-        <xsd:restriction base="dms:Unknown"/>
-      </xsd:simpleType>
-    </xsd:element>
-    <xsd:element name="MediaServiceObjectDetectorVersions" ma:index="24" nillable="true" ma:displayName="MediaServiceObjectDetectorVersions" ma:description="" ma:hidden="true" ma:indexed="true" ma:internalName="MediaServiceObjectDetectorVersions" ma:readOnly="true">
-      <xsd:simpleType>
-        <xsd:restriction base="dms:Text"/>
-      </xsd:simpleType>
-    </xsd:element>
-    <xsd:element name="MediaServiceSearchProperties" ma:index="25" nillable="true" ma:displayName="MediaServiceSearchProperties" ma:hidden="true" ma:internalName="MediaServiceSearchProperties" ma:readOnly="true">
-      <xsd:simpleType>
-        <xsd:restriction base="dms:Note"/>
-      </xsd:simpleType>
-    </xsd:element>
-  </xsd:schema>
-  <xsd:schema xmlns:xsd="http://www.w3.org/2001/XMLSchema" xmlns:xs="http://www.w3.org/2001/XMLSchema" xmlns:dms="http://schemas.microsoft.com/office/2006/documentManagement/types" xmlns:pc="http://schemas.microsoft.com/office/infopath/2007/PartnerControls" targetNamespace="d3095238-afb0-46db-b5e2-5361e02e2315" elementFormDefault="qualified">
-    <xsd:import namespace="http://schemas.microsoft.com/office/2006/documentManagement/types"/>
-    <xsd:import namespace="http://schemas.microsoft.com/office/infopath/2007/PartnerControls"/>
-    <xsd:element name="SharedWithUsers" ma:index="18" nillable="true" ma:displayName="Shared With" ma:internalName="SharedWithUsers" ma:readOnly="true">
-      <xsd:complexType>
-        <xsd:complexContent>
-          <xsd:extension base="dms:UserMulti">
-            <xsd:sequence>
-              <xsd:element name="UserInfo" minOccurs="0" maxOccurs="unbounded">
-                <xsd:complexType>
-                  <xsd:sequence>
-                    <xsd:element name="DisplayName" type="xsd:string" minOccurs="0"/>
-                    <xsd:element name="AccountId" type="dms:UserId" minOccurs="0" nillable="true"/>
-                    <xsd:element name="AccountType" type="xsd:string" minOccurs="0"/>
-                  </xsd:sequence>
-                </xsd:complexType>
-              </xsd:element>
-            </xsd:sequence>
-          </xsd:extension>
-        </xsd:complexContent>
-      </xsd:complexType>
-    </xsd:element>
-    <xsd:element name="SharedWithDetails" ma:index="19" nillable="true" ma:displayName="Shared With Details" ma:internalName="SharedWithDetails" ma:readOnly="true">
-      <xsd:simpleType>
-        <xsd:restriction base="dms:Note">
-          <xsd:maxLength value="255"/>
-        </xsd:restriction>
-      </xsd:simpleType>
-    </xsd:element>
-    <xsd:element name="TaxCatchAll" ma:index="22" nillable="true" ma:displayName="Taxonomy Catch All Column" ma:hidden="true" ma:list="{f76820f3-565e-41b4-b1e0-7b8ced4e0405}" ma:internalName="TaxCatchAll" ma:showField="CatchAllData" ma:web="d3095238-afb0-46db-b5e2-5361e02e2315">
-      <xsd:complexType>
-        <xsd:complexContent>
-          <xsd:extension base="dms:MultiChoiceLookup">
-            <xsd:sequence>
-              <xsd:element name="Value" type="dms:Lookup" maxOccurs="unbounded" minOccurs="0" nillable="true"/>
-            </xsd:sequence>
-          </xsd:extension>
-        </xsd:complexContent>
-      </xsd:complexType>
-    </xsd:element>
-  </xsd:schema>
-  <xsd:schema xmlns="http://schemas.openxmlformats.org/package/2006/metadata/core-properties" xmlns:xsd="http://www.w3.org/2001/XMLSchema" xmlns:xsi="http://www.w3.org/2001/XMLSchema-instance" xmlns:dc="http://purl.org/dc/elements/1.1/" xmlns:dcterms="http://purl.org/dc/terms/" xmlns:odoc="http://schemas.microsoft.com/internal/obd" targetNamespace="http://schemas.openxmlformats.org/package/2006/metadata/core-properties" elementFormDefault="qualified" attributeFormDefault="unqualified" blockDefault="#all">
-    <xsd:import namespace="http://purl.org/dc/elements/1.1/" schemaLocation="http://dublincore.org/schemas/xmls/qdc/2003/04/02/dc.xsd"/>
-    <xsd:import namespace="http://purl.org/dc/terms/" schemaLocation="http://dublincore.org/schemas/xmls/qdc/2003/04/02/dcterms.xsd"/>
-    <xsd:element name="coreProperties" type="CT_coreProperties"/>
-    <xsd:complexType name="CT_coreProperties">
-      <xsd:all>
-        <xsd:element ref="dc:creator" minOccurs="0" maxOccurs="1"/>
-        <xsd:element ref="dcterms:created" minOccurs="0" maxOccurs="1"/>
-        <xsd:element ref="dc:identifier" minOccurs="0" maxOccurs="1"/>
-        <xsd:element name="contentType" minOccurs="0" maxOccurs="1" type="xsd:string" ma:index="0" ma:displayName="Content Type"/>
-        <xsd:element ref="dc:title" minOccurs="0" maxOccurs="1" ma:index="4" ma:displayName="Title"/>
-        <xsd:element ref="dc:subject" minOccurs="0" maxOccurs="1"/>
-        <xsd:element ref="dc:description" minOccurs="0" maxOccurs="1"/>
-        <xsd:element name="keywords" minOccurs="0" maxOccurs="1" type="xsd:string"/>
-        <xsd:element ref="dc:language" minOccurs="0" maxOccurs="1"/>
-        <xsd:element name="category" minOccurs="0" maxOccurs="1" type="xsd:string"/>
-        <xsd:element name="version" minOccurs="0" maxOccurs="1" type="xsd:string"/>
-        <xsd:element name="revision" minOccurs="0" maxOccurs="1" type="xsd:string">
-          <xsd:annotation>
-            <xsd:documentation>
-                        This value indicates the number of saves or revisions. The application is responsible for updating this value after each revision.
-                    </xsd:documentation>
-          </xsd:annotation>
-        </xsd:element>
-        <xsd:element name="lastModifiedBy" minOccurs="0" maxOccurs="1" type="xsd:string"/>
-        <xsd:element ref="dcterms:modified" minOccurs="0" maxOccurs="1"/>
-        <xsd:element name="contentStatus" minOccurs="0" maxOccurs="1" type="xsd:string"/>
-      </xsd:all>
-    </xsd:complexType>
-  </xsd:schema>
-  <xs:schema xmlns:pc="http://schemas.microsoft.com/office/infopath/2007/PartnerControls" xmlns:xs="http://www.w3.org/2001/XMLSchema" targetNamespace="http://schemas.microsoft.com/office/infopath/2007/PartnerControls" elementFormDefault="qualified" attributeFormDefault="unqualified">
-    <xs:element name="Person">
-      <xs:complexType>
-        <xs:sequence>
-          <xs:element ref="pc:DisplayName" minOccurs="0"/>
-          <xs:element ref="pc:AccountId" minOccurs="0"/>
-          <xs:element ref="pc:AccountType" minOccurs="0"/>
-        </xs:sequence>
-      </xs:complexType>
-    </xs:element>
-    <xs:element name="DisplayName" type="xs:string"/>
-    <xs:element name="AccountId" type="xs:string"/>
-    <xs:element name="AccountType" type="xs:string"/>
-    <xs:element name="BDCAssociatedEntity">
-      <xs:complexType>
-        <xs:sequence>
-          <xs:element ref="pc:BDCEntity" minOccurs="0" maxOccurs="unbounded"/>
-        </xs:sequence>
-        <xs:attribute ref="pc:EntityNamespace"/>
-        <xs:attribute ref="pc:EntityName"/>
-        <xs:attribute ref="pc:SystemInstanceName"/>
-        <xs:attribute ref="pc:AssociationName"/>
-      </xs:complexType>
-    </xs:element>
-    <xs:attribute name="EntityNamespace" type="xs:string"/>
-    <xs:attribute name="EntityName" type="xs:string"/>
-    <xs:attribute name="SystemInstanceName" type="xs:string"/>
-    <xs:attribute name="AssociationName" type="xs:string"/>
-    <xs:element name="BDCEntity">
-      <xs:complexType>
-        <xs:sequence>
-          <xs:element ref="pc:EntityDisplayName" minOccurs="0"/>
-          <xs:element ref="pc:EntityInstanceReference" minOccurs="0"/>
-          <xs:element ref="pc:EntityId1" minOccurs="0"/>
-          <xs:element ref="pc:EntityId2" minOccurs="0"/>
-          <xs:element ref="pc:EntityId3" minOccurs="0"/>
-          <xs:element ref="pc:EntityId4" minOccurs="0"/>
-          <xs:element ref="pc:EntityId5" minOccurs="0"/>
-        </xs:sequence>
-      </xs:complexType>
-    </xs:element>
-    <xs:element name="EntityDisplayName" type="xs:string"/>
-    <xs:element name="EntityInstanceReference" type="xs:string"/>
-    <xs:element name="EntityId1" type="xs:string"/>
-    <xs:element name="EntityId2" type="xs:string"/>
-    <xs:element name="EntityId3" type="xs:string"/>
-    <xs:element name="EntityId4" type="xs:string"/>
-    <xs:element name="EntityId5" type="xs:string"/>
-    <xs:element name="Terms">
-      <xs:complexType>
-        <xs:sequence>
-          <xs:element ref="pc:TermInfo" minOccurs="0" maxOccurs="unbounded"/>
-        </xs:sequence>
-      </xs:complexType>
-    </xs:element>
-    <xs:element name="TermInfo">
-      <xs:complexType>
-        <xs:sequence>
-          <xs:element ref="pc:TermName" minOccurs="0"/>
-          <xs:element ref="pc:TermId" minOccurs="0"/>
-        </xs:sequence>
-      </xs:complexType>
-    </xs:element>
-    <xs:element name="TermName" type="xs:string"/>
-    <xs:element name="TermId" type="xs:string"/>
-  </xs:schema>
-</ct:contentTypeSchema>
-</file>
-
-<file path=customXml/itemProps1.xml><?xml version="1.0" encoding="utf-8"?>
-<ds:datastoreItem xmlns:ds="http://schemas.openxmlformats.org/officeDocument/2006/customXml" ds:itemID="{470987EE-C585-4F93-97FB-CC0BED43802B}">
-  <ds:schemaRefs>
-    <ds:schemaRef ds:uri="http://schemas.openxmlformats.org/officeDocument/2006/bibliography"/>
-  </ds:schemaRefs>
-</ds:datastoreItem>
-</file>
-
-<file path=customXml/itemProps2.xml><?xml version="1.0" encoding="utf-8"?>
-<ds:datastoreItem xmlns:ds="http://schemas.openxmlformats.org/officeDocument/2006/customXml" ds:itemID="{3B25287A-E0C4-425A-94B9-ACF9F7E4F1CB}">
-  <ds:schemaRefs>
-    <ds:schemaRef ds:uri="http://schemas.microsoft.com/sharepoint/v3/contenttype/forms"/>
-  </ds:schemaRefs>
-</ds:datastoreItem>
-</file>
-
-<file path=customXml/itemProps3.xml><?xml version="1.0" encoding="utf-8"?>
-<ds:datastoreItem xmlns:ds="http://schemas.openxmlformats.org/officeDocument/2006/customXml" ds:itemID="{A970F238-3A72-4534-AB98-808FA5724E0E}">
-  <ds:schemaRefs>
-    <ds:schemaRef ds:uri="http://schemas.microsoft.com/office/2006/metadata/properties"/>
-    <ds:schemaRef ds:uri="http://schemas.microsoft.com/office/infopath/2007/PartnerControls"/>
-    <ds:schemaRef ds:uri="d902a471-6d23-409f-beeb-c1cf95669feb"/>
-    <ds:schemaRef ds:uri="d3095238-afb0-46db-b5e2-5361e02e2315"/>
-  </ds:schemaRefs>
-</ds:datastoreItem>
-</file>
-
-<file path=customXml/itemProps4.xml><?xml version="1.0" encoding="utf-8"?>
-<ds:datastoreItem xmlns:ds="http://schemas.openxmlformats.org/officeDocument/2006/customXml" ds:itemID="{AB289AE6-61FE-419D-A553-CFF1C6FAF650}">
-  <ds:schemaRefs>
-    <ds:schemaRef ds:uri="http://schemas.microsoft.com/office/2006/metadata/contentType"/>
-    <ds:schemaRef ds:uri="http://schemas.microsoft.com/office/2006/metadata/properties/metaAttributes"/>
-    <ds:schemaRef ds:uri="http://www.w3.org/2001/XMLSchema"/>
-    <ds:schemaRef ds:uri="http://schemas.microsoft.com/office/2006/metadata/properties"/>
-    <ds:schemaRef ds:uri="d902a471-6d23-409f-beeb-c1cf95669feb"/>
-    <ds:schemaRef ds:uri="d3095238-afb0-46db-b5e2-5361e02e2315"/>
-    <ds:schemaRef ds:uri="http://schemas.microsoft.com/office/2006/documentManagement/types"/>
-    <ds:schemaRef ds:uri="http://schemas.microsoft.com/office/infopath/2007/PartnerControls"/>
-    <ds:schemaRef ds:uri="http://schemas.openxmlformats.org/package/2006/metadata/core-properties"/>
-    <ds:schemaRef ds:uri="http://purl.org/dc/elements/1.1/"/>
-    <ds:schemaRef ds:uri="http://purl.org/dc/terms/"/>
-    <ds:schemaRef ds:uri="http://schemas.microsoft.com/internal/obd"/>
-  </ds:schemaRefs>
-</ds:datastoreItem>
 </file>
</xml_diff>